<commit_message>
docs: magazine — the blacksmith story behind the name
Replaces the placeholder on the background question with the founder's
own account: the blacksmith who lived near the family house and made
parts for the farmers around them, watched every morning as a child.
Keeps "I'm not a blacksmith myself", moves the admiration from the fire
to the capability, and holds the origin of the company's name back to
the last line so it lands with the closing idea.

Co-Authored-By: Claude Opus 5 <noreply@anthropic.com>
Claude-Session: https://claude.ai/code/session_01XuNSKfFGFgyRA5WffAv1uC
</commit_message>
<xml_diff>
--- a/scratch/UniPods_Magazine_Forgeron_LamineSACKO.docx
+++ b/scratch/UniPods_Magazine_Forgeron_LamineSACKO.docx
@@ -79,7 +79,7 @@
           <w:color w:val="1F7A33"/>
           <w:sz w:val="22"/>
         </w:rPr>
-        <w:t>I studied mechatronics engineering at the École Nationale d'Ingénieurs Abderhamane Baba Touré (ENI-ABT) in Bamako.</w:t>
+        <w:t>I studied mechatronics engineering at the École Nationale d'Ingénieurs Abderhamane Baba Touré (ENI-ABT) in Bamako. But the real beginning came long before that, and it has a name.</w:t>
       </w:r>
     </w:p>
     <w:p>
@@ -89,11 +89,25 @@
       <w:r>
         <w:rPr>
           <w:b w:val="0"/>
-          <w:i/>
-          <w:color w:val="C00000"/>
+          <w:i w:val="0"/>
+          <w:color w:val="1F7A33"/>
           <w:sz w:val="22"/>
         </w:rPr>
-        <w:t>[[À COMPLÉTER — 3 ou 4 phrases, en ton nom. Ce qui t'a amené à construire des choses : un souvenir d'enfance (démonter, réparer), un atelier que tu fréquentais, la première machine que tu as faite marcher. Regarde la réponse d'Alumbwe : il raconte ses produits précédents puis conclut par une phrase simple sur le déclic. Une scène concrète vaut mieux qu'une déclaration.]]</w:t>
+        <w:t>In our communities, the forgeron — the blacksmith — is the maker. He is the one who produces whatever the community needs, out of metal and his own hands. I'm not a blacksmith myself, but one lived close to our house, and he made parts for the farmers around us: tools, spares, whatever anyone brought him. Every morning I would go and watch him work. I was a child and I found it extraordinary — not the fire or the noise, but the sheer capability of it. Whatever was asked of him, he could make it.</w:t>
+      </w:r>
+    </w:p>
+    <w:p>
+      <w:pPr>
+        <w:spacing w:before="0" w:after="120"/>
+      </w:pPr>
+      <w:r>
+        <w:rPr>
+          <w:b w:val="0"/>
+          <w:i w:val="0"/>
+          <w:color w:val="1F7A33"/>
+          <w:sz w:val="22"/>
+        </w:rPr>
+        <w:t>That never left me. When I finished my studies I didn't want to design machines on paper; I wanted to make things, the way he did. It's also where our name comes from. We called the company Forgeron because that is exactly what we are trying to put back into the workshop: the ability to make whatever is asked for, here.</w:t>
       </w:r>
     </w:p>
     <w:p>

</xml_diff>

<commit_message>
docs: magazine — the internship where the gap became visible
Fills the "when did you first notice" question with the founder's own
scene: modelling parts as a student engineer at Kouratechnique that no
workshop in the country could then manufacture, so the drawings went to
India and came back as finished parts. Closes on the loop that the same
workshop is now the first pilot prospect.

Co-Authored-By: Claude Opus 5 <noreply@anthropic.com>
Claude-Session: https://claude.ai/code/session_01XuNSKfFGFgyRA5WffAv1uC
</commit_message>
<xml_diff>
--- a/scratch/UniPods_Magazine_Forgeron_LamineSACKO.docx
+++ b/scratch/UniPods_Magazine_Forgeron_LamineSACKO.docx
@@ -197,11 +197,53 @@
       <w:r>
         <w:rPr>
           <w:b w:val="0"/>
-          <w:i/>
-          <w:color w:val="C00000"/>
+          <w:i w:val="0"/>
+          <w:color w:val="1F7A33"/>
           <w:sz w:val="22"/>
         </w:rPr>
-        <w:t>[[À COMPLÉTER — c'est la question la plus personnelle du magazine, et celle que les lecteurs retiennent. Raconte UN moment précis : un atelier où tu as vu refuser une pièce, une réparation impossible dans ta famille, un stage. Quand, où, qui était là, ce qui s'est dit. Si tu me donnes la scène en français, même en vrac, je la rédige.]]</w:t>
+        <w:t>During my engineering studies I did internships in several companies. One of them was Kouratechnique, a workshop here in Bamako, where I worked as a student engineer on design: I modelled parts on the computer.</w:t>
+      </w:r>
+    </w:p>
+    <w:p>
+      <w:pPr>
+        <w:spacing w:before="0" w:after="120"/>
+      </w:pPr>
+      <w:r>
+        <w:rPr>
+          <w:b w:val="0"/>
+          <w:i w:val="0"/>
+          <w:color w:val="1F7A33"/>
+          <w:sz w:val="22"/>
+        </w:rPr>
+        <w:t>That is where I saw it clearly. I would finish a part, and then we would find that we could not make it here. Not because the design was wrong, but because no workshop in the country had the machine for it. So the drawings were sent abroad, to manufacturers in India, who made the parts and shipped them back to us.</w:t>
+      </w:r>
+    </w:p>
+    <w:p>
+      <w:pPr>
+        <w:spacing w:before="0" w:after="120"/>
+      </w:pPr>
+      <w:r>
+        <w:rPr>
+          <w:b w:val="0"/>
+          <w:i w:val="0"/>
+          <w:color w:val="1F7A33"/>
+          <w:sz w:val="22"/>
+        </w:rPr>
+        <w:t>I was designing things my own country could not build. That is a strange feeling for a young engineer. The gap wasn't knowledge — we had the drawings and we had the skill. The gap was one machine. That is when I decided to build it.</w:t>
+      </w:r>
+    </w:p>
+    <w:p>
+      <w:pPr>
+        <w:spacing w:before="0" w:after="120"/>
+      </w:pPr>
+      <w:r>
+        <w:rPr>
+          <w:b w:val="0"/>
+          <w:i w:val="0"/>
+          <w:color w:val="1F7A33"/>
+          <w:sz w:val="22"/>
+        </w:rPr>
+        <w:t>Kouratechnique is also the first workshop we are now talking to about a pilot. I would like the machine to go back to where the problem started.</w:t>
       </w:r>
     </w:p>
     <w:p>

</xml_diff>

<commit_message>
docs: magazine — MIT course answer
Course completed; the answer keeps what the founder actually valued:
depth in how the models work underneath, and joining AI to
manufacturing rather than building a general-purpose AI product.

Co-Authored-By: Claude Opus 5 <noreply@anthropic.com>
Claude-Session: https://claude.ai/code/session_01XuNSKfFGFgyRA5WffAv1uC
</commit_message>
<xml_diff>
--- a/scratch/UniPods_Magazine_Forgeron_LamineSACKO.docx
+++ b/scratch/UniPods_Magazine_Forgeron_LamineSACKO.docx
@@ -444,11 +444,25 @@
       <w:r>
         <w:rPr>
           <w:b w:val="0"/>
-          <w:i/>
-          <w:color w:val="C00000"/>
+          <w:i w:val="0"/>
+          <w:color w:val="1F7A33"/>
           <w:sz w:val="22"/>
         </w:rPr>
-        <w:t>[[À COMPLÉTER sur MIT — une phrase ou deux : ce que le cours t'a apporté concrètement. Si tu ne l'as pas terminé, dis-le simplement, c'est mieux qu'un compliment vague.]]</w:t>
+        <w:t>I completed the MIT Universal AI course. It gave me real depth in artificial intelligence — not just how to use the tools, but how they actually work underneath — and that is what allowed me to take our own AI agent to a much higher level.</w:t>
+      </w:r>
+    </w:p>
+    <w:p>
+      <w:pPr>
+        <w:spacing w:before="0" w:after="120"/>
+      </w:pPr>
+      <w:r>
+        <w:rPr>
+          <w:b w:val="0"/>
+          <w:i w:val="0"/>
+          <w:color w:val="1F7A33"/>
+          <w:sz w:val="22"/>
+        </w:rPr>
+        <w:t>What mattered most to me, though, was being able to put the two things together: artificial intelligence and manufacturing. I never wanted to build a general-purpose AI product. I wanted AI that makes metal parts, and the course gave me the foundation to do that properly.</w:t>
       </w:r>
     </w:p>
     <w:p>

</xml_diff>

<commit_message>
docs: magazine — hardest moment is money, not engineering
Replaces the drafted hardware-failure answer with the founder's own:
funding the build out of pocket while moving from student to engineer,
and the insight that the constraint set the product's core design — the
machine is cheap because he could not afford it to be otherwise. Ends
on the customer problem, still unresolved and stated as such.

Co-Authored-By: Claude Opus 5 <noreply@anthropic.com>
Claude-Session: https://claude.ai/code/session_01XuNSKfFGFgyRA5WffAv1uC
</commit_message>
<xml_diff>
--- a/scratch/UniPods_Magazine_Forgeron_LamineSACKO.docx
+++ b/scratch/UniPods_Magazine_Forgeron_LamineSACKO.docx
@@ -558,7 +558,7 @@
           <w:color w:val="1F7A33"/>
           <w:sz w:val="22"/>
         </w:rPr>
-        <w:t>The machine has broken down three times in ways that took days to find — not a loose wire, but faults where the symptom was nowhere near the cause. Each time I had to stop building features and go back to the hardware, with deadlines getting closer.</w:t>
+        <w:t>Money. I started this just as I was moving from being a student to being an engineer, and students in Mali don't have money. Technically the machine was never the hard part — I knew how to build it. Paying for it was another matter. Every component came out of my own pocket, and for a long time what held the project back wasn't what I could design, it was what I could afford that month.</w:t>
       </w:r>
     </w:p>
     <w:p>
@@ -572,7 +572,7 @@
           <w:color w:val="1F7A33"/>
           <w:sz w:val="22"/>
         </w:rPr>
-        <w:t>What got me through it was writing down every failure: what triggered it, how we detected it, what guard we added afterwards. That file is now part of the project. Later, when the AI model started misbehaving — inventing machine code, drifting into another language mid-sentence — we added those to the same list. The failures became the safety rules.</w:t>
+        <w:t>Looking back, that constraint shaped the product. Because I couldn't afford expensive components, I had to find the cheapest honest way to build a machine that still works properly. That is exactly why ours costs around fifteen thousand dollars instead of forty thousand. The limitation became the design.</w:t>
       </w:r>
     </w:p>
     <w:p>
@@ -586,21 +586,7 @@
           <w:color w:val="1F7A33"/>
           <w:sz w:val="22"/>
         </w:rPr>
-        <w:t>I don't think I would trust the machine today if it had never broken.</w:t>
-      </w:r>
-    </w:p>
-    <w:p>
-      <w:pPr>
-        <w:spacing w:before="0" w:after="120"/>
-      </w:pPr>
-      <w:r>
-        <w:rPr>
-          <w:b w:val="0"/>
-          <w:i/>
-          <w:color w:val="C00000"/>
-          <w:sz w:val="22"/>
-        </w:rPr>
-        <w:t>[[Si tu préfères un moment plus personnel — le financement, la fatigue, un moment de doute — dis-le-moi et je réécris. Celui-ci est vrai et documenté, mais c'est toi qui choisis ce que tu racontes.]]</w:t>
+        <w:t>The second hard thing is still in front of me: customers. We can build the machine; we have not yet found the people who will buy it and let us produce it at scale. That one isn't solved. We are working on it right now, and I would rather say so than pretend otherwise.</w:t>
       </w:r>
     </w:p>
     <w:p>

</xml_diff>

<commit_message>
docs: magazine complete — the first part, and what it meant
Last placeholder filled: relief rather than triumph on holding the
first part, Aboubacar's share in it, and the hope that followed. All
nineteen answers are now written.

Co-Authored-By: Claude Opus 5 <noreply@anthropic.com>
Claude-Session: https://claude.ai/code/session_01XuNSKfFGFgyRA5WffAv1uC
</commit_message>
<xml_diff>
--- a/scratch/UniPods_Magazine_Forgeron_LamineSACKO.docx
+++ b/scratch/UniPods_Magazine_Forgeron_LamineSACKO.docx
@@ -705,11 +705,25 @@
       <w:r>
         <w:rPr>
           <w:b w:val="0"/>
-          <w:i/>
-          <w:color w:val="C00000"/>
+          <w:i w:val="0"/>
+          <w:color w:val="1F7A33"/>
           <w:sz w:val="22"/>
         </w:rPr>
-        <w:t>[[Facultatif — une phrase sur ce que tu as ressenti ce jour-là, ou sur la réaction d'Aboubacar. Une ligne suffit.]]</w:t>
+        <w:t>What I felt most, holding it, was relief. All the money I had put in, all the nights and the physical work — it had meant something after all. Aboubacar was just as happy; most of what was moving in front of us had passed through his hands.</w:t>
+      </w:r>
+    </w:p>
+    <w:p>
+      <w:pPr>
+        <w:spacing w:before="0" w:after="120"/>
+      </w:pPr>
+      <w:r>
+        <w:rPr>
+          <w:b w:val="0"/>
+          <w:i w:val="0"/>
+          <w:color w:val="1F7A33"/>
+          <w:sz w:val="22"/>
+        </w:rPr>
+        <w:t>And it gave me hope. We didn't build this for a laboratory. We built it for workshops like the ones around us, and for the first time I could picture it in all of them.</w:t>
       </w:r>
     </w:p>
     <w:p>

</xml_diff>